<commit_message>
Add individual meeting form with Hala (STEM) and mark Tuesday period 4 as the meeting slot in the calendar
Co-Authored-By: Claude Opus 5.5 <noreply@anthropic.com>
Claude-Session: https://claude.ai/code/session_015UeWUBiJ6TrLooN2qY58Sx
</commit_message>
<xml_diff>
--- a/رزنامة_STEM_محمد_عبدالله_أيلول_الأسبوع3.docx
+++ b/رزنامة_STEM_محمد_عبدالله_أيلول_الأسبوع3.docx
@@ -2327,7 +2327,7 @@
               <w:rPr>
                 <w:rtl w:val="0"/>
               </w:rPr>
-              <w:t>حصة دين</w:t>
+              <w:t>لقاء فردي مع المعلمة هالة</w:t>
             </w:r>
           </w:p>
         </w:tc>
@@ -2355,7 +2355,7 @@
                 <w:szCs w:val="24"/>
                 <w:rtl w:val="1"/>
               </w:rPr>
-              <w:t>المشاركة في حصة الدين.</w:t>
+              <w:t>عقد لقاء فردي مع الطالبة المعلمة هالة: التعريف بمادة STEM وآلية الانطلاق فيها، والاتفاق على خطوات العمل والتوصيات (موثّق في استمارة لقاء فردي).</w:t>
             </w:r>
           </w:p>
         </w:tc>

</xml_diff>